<commit_message>
Update app UX and sync current workspace state
</commit_message>
<xml_diff>
--- a/output/doc/mtb_galaxy_plan.docx
+++ b/output/doc/mtb_galaxy_plan.docx
@@ -202,6 +202,22 @@
           <w:i w:val="0"/>
           <w:sz w:val="28"/>
         </w:rPr>
+        <w:t>Реально работающие social/QR/AI модули: маршруты /app/friends, /app/qr, /app/ai и соответствующие backend endpoint-ы /friends, /qr/*, /assistant/*.</w:t>
+      </w:r>
+    </w:p>
+    <w:p>
+      <w:pPr>
+        <w:pStyle w:val="ListBullet"/>
+        <w:spacing w:after="80" w:line="312" w:lineRule="auto"/>
+        <w:jc w:val="both"/>
+      </w:pPr>
+      <w:r>
+        <w:rPr>
+          <w:rFonts w:ascii="Times New Roman" w:hAnsi="Times New Roman" w:eastAsia="Times New Roman"/>
+          <w:b w:val="0"/>
+          <w:i w:val="0"/>
+          <w:sz w:val="28"/>
+        </w:rPr>
         <w:t>Набор мини-игр: Halva Snake, Credit Shield Reactor, Social Ring Signal и дополнительные игровые страницы MVP.</w:t>
       </w:r>
     </w:p>
@@ -233,7 +249,7 @@
           <w:i w:val="0"/>
           <w:sz w:val="28"/>
         </w:rPr>
-        <w:t>Ниже приведено сопоставление основных пунктов исходного Word-плана и фактической реализации в репозитории. Это позволяет показать, какие элементы полностью сохранены, какие были усилены и какие были адаптированы под формат web-MVP.</w:t>
+        <w:t>Ниже приведено сопоставление основных пунктов исходного Word-плана и фактической реализации в репозитории. Это позволяет показать, какие элементы полностью сохранены и какие были расширены относительно базовой постановки.</w:t>
       </w:r>
     </w:p>
     <w:tbl>
@@ -564,7 +580,7 @@
                 <w:i w:val="0"/>
                 <w:sz w:val="21"/>
               </w:rPr>
-              <w:t>Выполнено в расширенном виде</w:t>
+              <w:t>Выполнено</w:t>
             </w:r>
           </w:p>
         </w:tc>
@@ -586,7 +602,7 @@
                 <w:i w:val="0"/>
                 <w:sz w:val="21"/>
               </w:rPr>
-              <w:t>Реализованы приглашения, лидерборд и социальное кольцо вместо простого списка друзей.</w:t>
+              <w:t>Есть FriendsPage по маршруту /app/friends и backend-методы /friends, /friends/invite, /friends/accept, /friends/activity.</w:t>
             </w:r>
           </w:p>
         </w:tc>
@@ -746,7 +762,7 @@
                 <w:i w:val="0"/>
                 <w:sz w:val="21"/>
               </w:rPr>
-              <w:t>AI/QR экраны из исходного плана</w:t>
+              <w:t>AI и QR экраны из исходного плана</w:t>
             </w:r>
           </w:p>
         </w:tc>
@@ -768,7 +784,7 @@
                 <w:i w:val="0"/>
                 <w:sz w:val="21"/>
               </w:rPr>
-              <w:t>Адаптировано</w:t>
+              <w:t>Выполнено</w:t>
             </w:r>
           </w:p>
         </w:tc>
@@ -790,7 +806,7 @@
                 <w:i w:val="0"/>
                 <w:sz w:val="21"/>
               </w:rPr>
-              <w:t>В текущем MVP упор смещен на игровые, квестовые и административные сценарии; отдельные AI и QR экраны не вынесены в финальный web-интерфейс.</w:t>
+              <w:t>Реализованы QrPage (/app/qr) и AiPage (/app/ai), а backend включает /qr/me, /qr/resolve, /assistant/context и /assistant/chat.</w:t>
             </w:r>
           </w:p>
         </w:tc>
@@ -954,6 +970,22 @@
           <w:sz w:val="19"/>
         </w:rPr>
         <w:t>│   │   │   ├── models.py</w:t>
+      </w:r>
+    </w:p>
+    <w:p>
+      <w:pPr>
+        <w:spacing w:after="0" w:before="0" w:line="240" w:lineRule="auto"/>
+        <w:ind w:left="425" w:right="170"/>
+        <w:jc w:val="left"/>
+      </w:pPr>
+      <w:r>
+        <w:rPr>
+          <w:rFonts w:ascii="Consolas" w:hAnsi="Consolas" w:eastAsia="Consolas"/>
+          <w:b w:val="0"/>
+          <w:i w:val="0"/>
+          <w:sz w:val="19"/>
+        </w:rPr>
+        <w:t>│   │   │   ├── schemas.py</w:t>
       </w:r>
     </w:p>
     <w:p>
@@ -1177,6 +1209,54 @@
           <w:i w:val="0"/>
           <w:sz w:val="19"/>
         </w:rPr>
+        <w:t>│       │   ├── FriendsPage.tsx</w:t>
+      </w:r>
+    </w:p>
+    <w:p>
+      <w:pPr>
+        <w:spacing w:after="0" w:before="0" w:line="240" w:lineRule="auto"/>
+        <w:ind w:left="425" w:right="170"/>
+        <w:jc w:val="left"/>
+      </w:pPr>
+      <w:r>
+        <w:rPr>
+          <w:rFonts w:ascii="Consolas" w:hAnsi="Consolas" w:eastAsia="Consolas"/>
+          <w:b w:val="0"/>
+          <w:i w:val="0"/>
+          <w:sz w:val="19"/>
+        </w:rPr>
+        <w:t>│       │   ├── QrPage.tsx</w:t>
+      </w:r>
+    </w:p>
+    <w:p>
+      <w:pPr>
+        <w:spacing w:after="0" w:before="0" w:line="240" w:lineRule="auto"/>
+        <w:ind w:left="425" w:right="170"/>
+        <w:jc w:val="left"/>
+      </w:pPr>
+      <w:r>
+        <w:rPr>
+          <w:rFonts w:ascii="Consolas" w:hAnsi="Consolas" w:eastAsia="Consolas"/>
+          <w:b w:val="0"/>
+          <w:i w:val="0"/>
+          <w:sz w:val="19"/>
+        </w:rPr>
+        <w:t>│       │   ├── AiPage.tsx</w:t>
+      </w:r>
+    </w:p>
+    <w:p>
+      <w:pPr>
+        <w:spacing w:after="0" w:before="0" w:line="240" w:lineRule="auto"/>
+        <w:ind w:left="425" w:right="170"/>
+        <w:jc w:val="left"/>
+      </w:pPr>
+      <w:r>
+        <w:rPr>
+          <w:rFonts w:ascii="Consolas" w:hAnsi="Consolas" w:eastAsia="Consolas"/>
+          <w:b w:val="0"/>
+          <w:i w:val="0"/>
+          <w:sz w:val="19"/>
+        </w:rPr>
         <w:t>│       │   ├── ReferralsPage.tsx</w:t>
       </w:r>
     </w:p>
@@ -1225,7 +1305,7 @@
           <w:i w:val="0"/>
           <w:sz w:val="19"/>
         </w:rPr>
-        <w:t>│       └── src/lib/</w:t>
+        <w:t>│       └── src/lib/api.ts</w:t>
       </w:r>
     </w:p>
     <w:p>
@@ -1480,6 +1560,22 @@
           <w:sz w:val="28"/>
         </w:rPr>
         <w:t>Главный экран GalaxyPage является центром сценария: на нем показаны планеты, игровые действия, статистика, прогресс и ссылки на остальные разделы. Дополнительно реализованы карты планет, отдельные игровые страницы, квесты, награды, реферальный раздел и админский блок. Интерфейс построен как единое SPA-приложение, что ускоряет демонстрацию и упрощает перенос в разные окружения.</w:t>
+      </w:r>
+    </w:p>
+    <w:p>
+      <w:pPr>
+        <w:spacing w:after="120" w:before="0" w:line="360" w:lineRule="auto"/>
+        <w:ind w:firstLine="709"/>
+        <w:jc w:val="both"/>
+      </w:pPr>
+      <w:r>
+        <w:rPr>
+          <w:rFonts w:ascii="Times New Roman" w:hAnsi="Times New Roman" w:eastAsia="Times New Roman"/>
+          <w:b w:val="0"/>
+          <w:i w:val="0"/>
+          <w:sz w:val="28"/>
+        </w:rPr>
+        <w:t>Отдельно от главного контура в web-клиенте присутствуют маршруты /app/friends, /app/qr и /app/ai. Они ведут соответственно на FriendsPage, QrPage и AiPage и закрывают именно те сценарии, которые были заложены в исходном плане: дружеские связи, QR-переходы и AI-помощник.</w:t>
       </w:r>
     </w:p>
     <w:tbl>
@@ -1790,7 +1886,7 @@
                 <w:i w:val="0"/>
                 <w:sz w:val="21"/>
               </w:rPr>
-              <w:t>ReferralsPage</w:t>
+              <w:t>FriendsPage (/app/friends)</w:t>
             </w:r>
           </w:p>
         </w:tc>
@@ -1812,7 +1908,7 @@
                 <w:i w:val="0"/>
                 <w:sz w:val="21"/>
               </w:rPr>
-              <w:t>Социальный сценарий, приглашения и работа с реферальной механикой.</w:t>
+              <w:t>Полноценный social MVP: списки друзей, инвайты, входящие заявки и переходы в QR-сценарий.</w:t>
             </w:r>
           </w:p>
         </w:tc>
@@ -1836,7 +1932,7 @@
                 <w:i w:val="0"/>
                 <w:sz w:val="21"/>
               </w:rPr>
-              <w:t>LeaderboardScreen</w:t>
+              <w:t>QrPage (/app/qr)</w:t>
             </w:r>
           </w:p>
         </w:tc>
@@ -1858,7 +1954,99 @@
                 <w:i w:val="0"/>
                 <w:sz w:val="21"/>
               </w:rPr>
-              <w:t>Турнирная таблица игроков.</w:t>
+              <w:t>Экран собственного QR и резолвера payload для маршрутов друзей, рефералов и AI-помощника.</w:t>
+            </w:r>
+          </w:p>
+        </w:tc>
+      </w:tr>
+      <w:tr>
+        <w:tc>
+          <w:tcPr>
+            <w:tcW w:type="dxa" w:w="4986"/>
+            <w:vAlign w:val="center"/>
+          </w:tcPr>
+          <w:p>
+            <w:pPr>
+              <w:spacing w:after="0" w:before="0"/>
+              <w:jc w:val="left"/>
+            </w:pPr>
+            <w:r/>
+            <w:r>
+              <w:rPr>
+                <w:rFonts w:ascii="Times New Roman" w:hAnsi="Times New Roman" w:eastAsia="Times New Roman"/>
+                <w:b w:val="0"/>
+                <w:i w:val="0"/>
+                <w:sz w:val="21"/>
+              </w:rPr>
+              <w:t>AiPage (/app/ai)</w:t>
+            </w:r>
+          </w:p>
+        </w:tc>
+        <w:tc>
+          <w:tcPr>
+            <w:tcW w:type="dxa" w:w="4986"/>
+            <w:vAlign w:val="center"/>
+          </w:tcPr>
+          <w:p>
+            <w:pPr>
+              <w:spacing w:after="0" w:before="0"/>
+              <w:jc w:val="left"/>
+            </w:pPr>
+            <w:r/>
+            <w:r>
+              <w:rPr>
+                <w:rFonts w:ascii="Times New Roman" w:hAnsi="Times New Roman" w:eastAsia="Times New Roman"/>
+                <w:b w:val="0"/>
+                <w:i w:val="0"/>
+                <w:sz w:val="21"/>
+              </w:rPr>
+              <w:t>AI-ассистент с контекстом по друзьям, квестам, QR и быстрыми сценариями навигации.</w:t>
+            </w:r>
+          </w:p>
+        </w:tc>
+      </w:tr>
+      <w:tr>
+        <w:tc>
+          <w:tcPr>
+            <w:tcW w:type="dxa" w:w="4986"/>
+            <w:vAlign w:val="center"/>
+          </w:tcPr>
+          <w:p>
+            <w:pPr>
+              <w:spacing w:after="0" w:before="0"/>
+              <w:jc w:val="left"/>
+            </w:pPr>
+            <w:r/>
+            <w:r>
+              <w:rPr>
+                <w:rFonts w:ascii="Times New Roman" w:hAnsi="Times New Roman" w:eastAsia="Times New Roman"/>
+                <w:b w:val="0"/>
+                <w:i w:val="0"/>
+                <w:sz w:val="21"/>
+              </w:rPr>
+              <w:t>ReferralsPage / LeaderboardScreen</w:t>
+            </w:r>
+          </w:p>
+        </w:tc>
+        <w:tc>
+          <w:tcPr>
+            <w:tcW w:type="dxa" w:w="4986"/>
+            <w:vAlign w:val="center"/>
+          </w:tcPr>
+          <w:p>
+            <w:pPr>
+              <w:spacing w:after="0" w:before="0"/>
+              <w:jc w:val="left"/>
+            </w:pPr>
+            <w:r/>
+            <w:r>
+              <w:rPr>
+                <w:rFonts w:ascii="Times New Roman" w:hAnsi="Times New Roman" w:eastAsia="Times New Roman"/>
+                <w:b w:val="0"/>
+                <w:i w:val="0"/>
+                <w:sz w:val="21"/>
+              </w:rPr>
+              <w:t>Реферальный сценарий и турнирная таблица игроков.</w:t>
             </w:r>
           </w:p>
         </w:tc>
@@ -2050,7 +2238,23 @@
           <w:i w:val="0"/>
           <w:sz w:val="28"/>
         </w:rPr>
-        <w:t>OpenAPI-описание проекта содержит 14 основных endpoint-ов. Они покрывают авторизацию демо-пользователя, профиль галактики, события, квесты, награды, мини-игры, рефералов, лидерборд и административный функционал.</w:t>
+        <w:t>OpenAPI-описание проекта содержит 22 основных endpoint-ов. Они покрывают авторизацию демо-пользователя, профиль галактики, события, квесты, награды, мини-игры, социальный модуль друзей, QR-механику, AI-помощника, рефералов, лидерборд и административный функционал.</w:t>
+      </w:r>
+    </w:p>
+    <w:p>
+      <w:pPr>
+        <w:spacing w:after="120" w:before="0" w:line="360" w:lineRule="auto"/>
+        <w:ind w:firstLine="709"/>
+        <w:jc w:val="both"/>
+      </w:pPr>
+      <w:r>
+        <w:rPr>
+          <w:rFonts w:ascii="Times New Roman" w:hAnsi="Times New Roman" w:eastAsia="Times New Roman"/>
+          <w:b w:val="0"/>
+          <w:i w:val="0"/>
+          <w:sz w:val="28"/>
+        </w:rPr>
+        <w:t>Для social/QR/AI контура в репозитории уже опубликованы и используются endpoint-ы /friends, /friends/invite, /friends/accept, /friends/activity, /qr/me, /qr/resolve, /assistant/context и /assistant/chat. Это не заглушки и не адаптационные заметки, а часть текущего рабочего API и маршрутизации web-клиента.</w:t>
       </w:r>
     </w:p>
     <w:tbl>
@@ -2676,6 +2880,550 @@
                 <w:sz w:val="21"/>
               </w:rPr>
               <w:t>Сводка по мини-играм и прогрессу.</w:t>
+            </w:r>
+          </w:p>
+        </w:tc>
+      </w:tr>
+      <w:tr>
+        <w:tc>
+          <w:tcPr>
+            <w:tcW w:type="dxa" w:w="3324"/>
+            <w:vAlign w:val="center"/>
+          </w:tcPr>
+          <w:p>
+            <w:pPr>
+              <w:spacing w:after="0" w:before="0"/>
+              <w:jc w:val="left"/>
+            </w:pPr>
+            <w:r/>
+            <w:r>
+              <w:rPr>
+                <w:rFonts w:ascii="Times New Roman" w:hAnsi="Times New Roman" w:eastAsia="Times New Roman"/>
+                <w:b w:val="0"/>
+                <w:i w:val="0"/>
+                <w:sz w:val="21"/>
+              </w:rPr>
+              <w:t>GET</w:t>
+            </w:r>
+          </w:p>
+        </w:tc>
+        <w:tc>
+          <w:tcPr>
+            <w:tcW w:type="dxa" w:w="3324"/>
+            <w:vAlign w:val="center"/>
+          </w:tcPr>
+          <w:p>
+            <w:pPr>
+              <w:spacing w:after="0" w:before="0"/>
+              <w:jc w:val="left"/>
+            </w:pPr>
+            <w:r/>
+            <w:r>
+              <w:rPr>
+                <w:rFonts w:ascii="Times New Roman" w:hAnsi="Times New Roman" w:eastAsia="Times New Roman"/>
+                <w:b w:val="0"/>
+                <w:i w:val="0"/>
+                <w:sz w:val="21"/>
+              </w:rPr>
+              <w:t>/friends</w:t>
+            </w:r>
+          </w:p>
+        </w:tc>
+        <w:tc>
+          <w:tcPr>
+            <w:tcW w:type="dxa" w:w="3324"/>
+            <w:vAlign w:val="center"/>
+          </w:tcPr>
+          <w:p>
+            <w:pPr>
+              <w:spacing w:after="0" w:before="0"/>
+              <w:jc w:val="left"/>
+            </w:pPr>
+            <w:r/>
+            <w:r>
+              <w:rPr>
+                <w:rFonts w:ascii="Times New Roman" w:hAnsi="Times New Roman" w:eastAsia="Times New Roman"/>
+                <w:b w:val="0"/>
+                <w:i w:val="0"/>
+                <w:sz w:val="21"/>
+              </w:rPr>
+              <w:t>Получение списков друзей, входящих и исходящих приглашений.</w:t>
+            </w:r>
+          </w:p>
+        </w:tc>
+      </w:tr>
+      <w:tr>
+        <w:tc>
+          <w:tcPr>
+            <w:tcW w:type="dxa" w:w="3324"/>
+            <w:vAlign w:val="center"/>
+          </w:tcPr>
+          <w:p>
+            <w:pPr>
+              <w:spacing w:after="0" w:before="0"/>
+              <w:jc w:val="left"/>
+            </w:pPr>
+            <w:r/>
+            <w:r>
+              <w:rPr>
+                <w:rFonts w:ascii="Times New Roman" w:hAnsi="Times New Roman" w:eastAsia="Times New Roman"/>
+                <w:b w:val="0"/>
+                <w:i w:val="0"/>
+                <w:sz w:val="21"/>
+              </w:rPr>
+              <w:t>POST</w:t>
+            </w:r>
+          </w:p>
+        </w:tc>
+        <w:tc>
+          <w:tcPr>
+            <w:tcW w:type="dxa" w:w="3324"/>
+            <w:vAlign w:val="center"/>
+          </w:tcPr>
+          <w:p>
+            <w:pPr>
+              <w:spacing w:after="0" w:before="0"/>
+              <w:jc w:val="left"/>
+            </w:pPr>
+            <w:r/>
+            <w:r>
+              <w:rPr>
+                <w:rFonts w:ascii="Times New Roman" w:hAnsi="Times New Roman" w:eastAsia="Times New Roman"/>
+                <w:b w:val="0"/>
+                <w:i w:val="0"/>
+                <w:sz w:val="21"/>
+              </w:rPr>
+              <w:t>/friends/invite</w:t>
+            </w:r>
+          </w:p>
+        </w:tc>
+        <w:tc>
+          <w:tcPr>
+            <w:tcW w:type="dxa" w:w="3324"/>
+            <w:vAlign w:val="center"/>
+          </w:tcPr>
+          <w:p>
+            <w:pPr>
+              <w:spacing w:after="0" w:before="0"/>
+              <w:jc w:val="left"/>
+            </w:pPr>
+            <w:r/>
+            <w:r>
+              <w:rPr>
+                <w:rFonts w:ascii="Times New Roman" w:hAnsi="Times New Roman" w:eastAsia="Times New Roman"/>
+                <w:b w:val="0"/>
+                <w:i w:val="0"/>
+                <w:sz w:val="21"/>
+              </w:rPr>
+              <w:t>Отправка приглашения в друзья вручную, по QR или реферальному сценарию.</w:t>
+            </w:r>
+          </w:p>
+        </w:tc>
+      </w:tr>
+      <w:tr>
+        <w:tc>
+          <w:tcPr>
+            <w:tcW w:type="dxa" w:w="3324"/>
+            <w:vAlign w:val="center"/>
+          </w:tcPr>
+          <w:p>
+            <w:pPr>
+              <w:spacing w:after="0" w:before="0"/>
+              <w:jc w:val="left"/>
+            </w:pPr>
+            <w:r/>
+            <w:r>
+              <w:rPr>
+                <w:rFonts w:ascii="Times New Roman" w:hAnsi="Times New Roman" w:eastAsia="Times New Roman"/>
+                <w:b w:val="0"/>
+                <w:i w:val="0"/>
+                <w:sz w:val="21"/>
+              </w:rPr>
+              <w:t>POST</w:t>
+            </w:r>
+          </w:p>
+        </w:tc>
+        <w:tc>
+          <w:tcPr>
+            <w:tcW w:type="dxa" w:w="3324"/>
+            <w:vAlign w:val="center"/>
+          </w:tcPr>
+          <w:p>
+            <w:pPr>
+              <w:spacing w:after="0" w:before="0"/>
+              <w:jc w:val="left"/>
+            </w:pPr>
+            <w:r/>
+            <w:r>
+              <w:rPr>
+                <w:rFonts w:ascii="Times New Roman" w:hAnsi="Times New Roman" w:eastAsia="Times New Roman"/>
+                <w:b w:val="0"/>
+                <w:i w:val="0"/>
+                <w:sz w:val="21"/>
+              </w:rPr>
+              <w:t>/friends/accept</w:t>
+            </w:r>
+          </w:p>
+        </w:tc>
+        <w:tc>
+          <w:tcPr>
+            <w:tcW w:type="dxa" w:w="3324"/>
+            <w:vAlign w:val="center"/>
+          </w:tcPr>
+          <w:p>
+            <w:pPr>
+              <w:spacing w:after="0" w:before="0"/>
+              <w:jc w:val="left"/>
+            </w:pPr>
+            <w:r/>
+            <w:r>
+              <w:rPr>
+                <w:rFonts w:ascii="Times New Roman" w:hAnsi="Times New Roman" w:eastAsia="Times New Roman"/>
+                <w:b w:val="0"/>
+                <w:i w:val="0"/>
+                <w:sz w:val="21"/>
+              </w:rPr>
+              <w:t>Подтверждение входящего приглашения и фиксация дружеской связи.</w:t>
+            </w:r>
+          </w:p>
+        </w:tc>
+      </w:tr>
+      <w:tr>
+        <w:tc>
+          <w:tcPr>
+            <w:tcW w:type="dxa" w:w="3324"/>
+            <w:vAlign w:val="center"/>
+          </w:tcPr>
+          <w:p>
+            <w:pPr>
+              <w:spacing w:after="0" w:before="0"/>
+              <w:jc w:val="left"/>
+            </w:pPr>
+            <w:r/>
+            <w:r>
+              <w:rPr>
+                <w:rFonts w:ascii="Times New Roman" w:hAnsi="Times New Roman" w:eastAsia="Times New Roman"/>
+                <w:b w:val="0"/>
+                <w:i w:val="0"/>
+                <w:sz w:val="21"/>
+              </w:rPr>
+              <w:t>GET</w:t>
+            </w:r>
+          </w:p>
+        </w:tc>
+        <w:tc>
+          <w:tcPr>
+            <w:tcW w:type="dxa" w:w="3324"/>
+            <w:vAlign w:val="center"/>
+          </w:tcPr>
+          <w:p>
+            <w:pPr>
+              <w:spacing w:after="0" w:before="0"/>
+              <w:jc w:val="left"/>
+            </w:pPr>
+            <w:r/>
+            <w:r>
+              <w:rPr>
+                <w:rFonts w:ascii="Times New Roman" w:hAnsi="Times New Roman" w:eastAsia="Times New Roman"/>
+                <w:b w:val="0"/>
+                <w:i w:val="0"/>
+                <w:sz w:val="21"/>
+              </w:rPr>
+              <w:t>/friends/activity</w:t>
+            </w:r>
+          </w:p>
+        </w:tc>
+        <w:tc>
+          <w:tcPr>
+            <w:tcW w:type="dxa" w:w="3324"/>
+            <w:vAlign w:val="center"/>
+          </w:tcPr>
+          <w:p>
+            <w:pPr>
+              <w:spacing w:after="0" w:before="0"/>
+              <w:jc w:val="left"/>
+            </w:pPr>
+            <w:r/>
+            <w:r>
+              <w:rPr>
+                <w:rFonts w:ascii="Times New Roman" w:hAnsi="Times New Roman" w:eastAsia="Times New Roman"/>
+                <w:b w:val="0"/>
+                <w:i w:val="0"/>
+                <w:sz w:val="21"/>
+              </w:rPr>
+              <w:t>Лента активности друзей и социального контура.</w:t>
+            </w:r>
+          </w:p>
+        </w:tc>
+      </w:tr>
+      <w:tr>
+        <w:tc>
+          <w:tcPr>
+            <w:tcW w:type="dxa" w:w="3324"/>
+            <w:vAlign w:val="center"/>
+          </w:tcPr>
+          <w:p>
+            <w:pPr>
+              <w:spacing w:after="0" w:before="0"/>
+              <w:jc w:val="left"/>
+            </w:pPr>
+            <w:r/>
+            <w:r>
+              <w:rPr>
+                <w:rFonts w:ascii="Times New Roman" w:hAnsi="Times New Roman" w:eastAsia="Times New Roman"/>
+                <w:b w:val="0"/>
+                <w:i w:val="0"/>
+                <w:sz w:val="21"/>
+              </w:rPr>
+              <w:t>GET</w:t>
+            </w:r>
+          </w:p>
+        </w:tc>
+        <w:tc>
+          <w:tcPr>
+            <w:tcW w:type="dxa" w:w="3324"/>
+            <w:vAlign w:val="center"/>
+          </w:tcPr>
+          <w:p>
+            <w:pPr>
+              <w:spacing w:after="0" w:before="0"/>
+              <w:jc w:val="left"/>
+            </w:pPr>
+            <w:r/>
+            <w:r>
+              <w:rPr>
+                <w:rFonts w:ascii="Times New Roman" w:hAnsi="Times New Roman" w:eastAsia="Times New Roman"/>
+                <w:b w:val="0"/>
+                <w:i w:val="0"/>
+                <w:sz w:val="21"/>
+              </w:rPr>
+              <w:t>/qr/me</w:t>
+            </w:r>
+          </w:p>
+        </w:tc>
+        <w:tc>
+          <w:tcPr>
+            <w:tcW w:type="dxa" w:w="3324"/>
+            <w:vAlign w:val="center"/>
+          </w:tcPr>
+          <w:p>
+            <w:pPr>
+              <w:spacing w:after="0" w:before="0"/>
+              <w:jc w:val="left"/>
+            </w:pPr>
+            <w:r/>
+            <w:r>
+              <w:rPr>
+                <w:rFonts w:ascii="Times New Roman" w:hAnsi="Times New Roman" w:eastAsia="Times New Roman"/>
+                <w:b w:val="0"/>
+                <w:i w:val="0"/>
+                <w:sz w:val="21"/>
+              </w:rPr>
+              <w:t>Получение собственного QR payload и CTA для дальнейшего сценария.</w:t>
+            </w:r>
+          </w:p>
+        </w:tc>
+      </w:tr>
+      <w:tr>
+        <w:tc>
+          <w:tcPr>
+            <w:tcW w:type="dxa" w:w="3324"/>
+            <w:vAlign w:val="center"/>
+          </w:tcPr>
+          <w:p>
+            <w:pPr>
+              <w:spacing w:after="0" w:before="0"/>
+              <w:jc w:val="left"/>
+            </w:pPr>
+            <w:r/>
+            <w:r>
+              <w:rPr>
+                <w:rFonts w:ascii="Times New Roman" w:hAnsi="Times New Roman" w:eastAsia="Times New Roman"/>
+                <w:b w:val="0"/>
+                <w:i w:val="0"/>
+                <w:sz w:val="21"/>
+              </w:rPr>
+              <w:t>POST</w:t>
+            </w:r>
+          </w:p>
+        </w:tc>
+        <w:tc>
+          <w:tcPr>
+            <w:tcW w:type="dxa" w:w="3324"/>
+            <w:vAlign w:val="center"/>
+          </w:tcPr>
+          <w:p>
+            <w:pPr>
+              <w:spacing w:after="0" w:before="0"/>
+              <w:jc w:val="left"/>
+            </w:pPr>
+            <w:r/>
+            <w:r>
+              <w:rPr>
+                <w:rFonts w:ascii="Times New Roman" w:hAnsi="Times New Roman" w:eastAsia="Times New Roman"/>
+                <w:b w:val="0"/>
+                <w:i w:val="0"/>
+                <w:sz w:val="21"/>
+              </w:rPr>
+              <w:t>/qr/resolve</w:t>
+            </w:r>
+          </w:p>
+        </w:tc>
+        <w:tc>
+          <w:tcPr>
+            <w:tcW w:type="dxa" w:w="3324"/>
+            <w:vAlign w:val="center"/>
+          </w:tcPr>
+          <w:p>
+            <w:pPr>
+              <w:spacing w:after="0" w:before="0"/>
+              <w:jc w:val="left"/>
+            </w:pPr>
+            <w:r/>
+            <w:r>
+              <w:rPr>
+                <w:rFonts w:ascii="Times New Roman" w:hAnsi="Times New Roman" w:eastAsia="Times New Roman"/>
+                <w:b w:val="0"/>
+                <w:i w:val="0"/>
+                <w:sz w:val="21"/>
+              </w:rPr>
+              <w:t>Разбор QR payload и определение действия: друзья, реферал или AI.</w:t>
+            </w:r>
+          </w:p>
+        </w:tc>
+      </w:tr>
+      <w:tr>
+        <w:tc>
+          <w:tcPr>
+            <w:tcW w:type="dxa" w:w="3324"/>
+            <w:vAlign w:val="center"/>
+          </w:tcPr>
+          <w:p>
+            <w:pPr>
+              <w:spacing w:after="0" w:before="0"/>
+              <w:jc w:val="left"/>
+            </w:pPr>
+            <w:r/>
+            <w:r>
+              <w:rPr>
+                <w:rFonts w:ascii="Times New Roman" w:hAnsi="Times New Roman" w:eastAsia="Times New Roman"/>
+                <w:b w:val="0"/>
+                <w:i w:val="0"/>
+                <w:sz w:val="21"/>
+              </w:rPr>
+              <w:t>GET</w:t>
+            </w:r>
+          </w:p>
+        </w:tc>
+        <w:tc>
+          <w:tcPr>
+            <w:tcW w:type="dxa" w:w="3324"/>
+            <w:vAlign w:val="center"/>
+          </w:tcPr>
+          <w:p>
+            <w:pPr>
+              <w:spacing w:after="0" w:before="0"/>
+              <w:jc w:val="left"/>
+            </w:pPr>
+            <w:r/>
+            <w:r>
+              <w:rPr>
+                <w:rFonts w:ascii="Times New Roman" w:hAnsi="Times New Roman" w:eastAsia="Times New Roman"/>
+                <w:b w:val="0"/>
+                <w:i w:val="0"/>
+                <w:sz w:val="21"/>
+              </w:rPr>
+              <w:t>/assistant/context</w:t>
+            </w:r>
+          </w:p>
+        </w:tc>
+        <w:tc>
+          <w:tcPr>
+            <w:tcW w:type="dxa" w:w="3324"/>
+            <w:vAlign w:val="center"/>
+          </w:tcPr>
+          <w:p>
+            <w:pPr>
+              <w:spacing w:after="0" w:before="0"/>
+              <w:jc w:val="left"/>
+            </w:pPr>
+            <w:r/>
+            <w:r>
+              <w:rPr>
+                <w:rFonts w:ascii="Times New Roman" w:hAnsi="Times New Roman" w:eastAsia="Times New Roman"/>
+                <w:b w:val="0"/>
+                <w:i w:val="0"/>
+                <w:sz w:val="21"/>
+              </w:rPr>
+              <w:t>Сбор контекста AI-помощника по друзьям, квестам и QR-сценариям.</w:t>
+            </w:r>
+          </w:p>
+        </w:tc>
+      </w:tr>
+      <w:tr>
+        <w:tc>
+          <w:tcPr>
+            <w:tcW w:type="dxa" w:w="3324"/>
+            <w:vAlign w:val="center"/>
+          </w:tcPr>
+          <w:p>
+            <w:pPr>
+              <w:spacing w:after="0" w:before="0"/>
+              <w:jc w:val="left"/>
+            </w:pPr>
+            <w:r/>
+            <w:r>
+              <w:rPr>
+                <w:rFonts w:ascii="Times New Roman" w:hAnsi="Times New Roman" w:eastAsia="Times New Roman"/>
+                <w:b w:val="0"/>
+                <w:i w:val="0"/>
+                <w:sz w:val="21"/>
+              </w:rPr>
+              <w:t>POST</w:t>
+            </w:r>
+          </w:p>
+        </w:tc>
+        <w:tc>
+          <w:tcPr>
+            <w:tcW w:type="dxa" w:w="3324"/>
+            <w:vAlign w:val="center"/>
+          </w:tcPr>
+          <w:p>
+            <w:pPr>
+              <w:spacing w:after="0" w:before="0"/>
+              <w:jc w:val="left"/>
+            </w:pPr>
+            <w:r/>
+            <w:r>
+              <w:rPr>
+                <w:rFonts w:ascii="Times New Roman" w:hAnsi="Times New Roman" w:eastAsia="Times New Roman"/>
+                <w:b w:val="0"/>
+                <w:i w:val="0"/>
+                <w:sz w:val="21"/>
+              </w:rPr>
+              <w:t>/assistant/chat</w:t>
+            </w:r>
+          </w:p>
+        </w:tc>
+        <w:tc>
+          <w:tcPr>
+            <w:tcW w:type="dxa" w:w="3324"/>
+            <w:vAlign w:val="center"/>
+          </w:tcPr>
+          <w:p>
+            <w:pPr>
+              <w:spacing w:after="0" w:before="0"/>
+              <w:jc w:val="left"/>
+            </w:pPr>
+            <w:r/>
+            <w:r>
+              <w:rPr>
+                <w:rFonts w:ascii="Times New Roman" w:hAnsi="Times New Roman" w:eastAsia="Times New Roman"/>
+                <w:b w:val="0"/>
+                <w:i w:val="0"/>
+                <w:sz w:val="21"/>
+              </w:rPr>
+              <w:t>Диалог с AI-помощником с учетом сообщения пользователя и QR payload.</w:t>
             </w:r>
           </w:p>
         </w:tc>

</xml_diff>